<commit_message>
docs: update user manual for v2.19.1
</commit_message>
<xml_diff>
--- a/Manual_de_usuario_Fichajes.docx
+++ b/Manual_de_usuario_Fichajes.docx
@@ -64,7 +64,7 @@
           <w:color w:val="5A626E"/>
           <w:sz w:val="22"/>
         </w:rPr>
-        <w:t>Versión de la aplicación 2.15.0</w:t>
+        <w:t>Versión de la aplicación 2.19.1</w:t>
       </w:r>
     </w:p>
     <w:p>
@@ -77,7 +77,7 @@
           <w:color w:val="5A626E"/>
           <w:sz w:val="20"/>
         </w:rPr>
-        <w:t>Actualizado el 30 de julio de 2026</w:t>
+        <w:t>Actualizado el 29 de octubre de 2026</w:t>
       </w:r>
     </w:p>
     <w:p>
@@ -1131,7 +1131,7 @@
           <w:rFonts w:ascii="Calibri" w:hAnsi="Calibri"/>
           <w:sz w:val="22"/>
         </w:rPr>
-        <w:t>Diferencia diaria y saldo de bolsa.</w:t>
+        <w:t>Salida recomendada de los viernes, separada de la salida guardada.</w:t>
       </w:r>
     </w:p>
     <w:p>
@@ -1146,24 +1146,7 @@
           <w:rFonts w:ascii="Calibri" w:hAnsi="Calibri"/>
           <w:sz w:val="22"/>
         </w:rPr>
-        <w:t>Marca de teletrabajo.</w:t>
-      </w:r>
-    </w:p>
-    <w:p>
-      <w:r>
-        <w:rPr>
-          <w:rFonts w:ascii="Calibri" w:hAnsi="Calibri"/>
-          <w:sz w:val="22"/>
-        </w:rPr>
-        <w:t>El botón del panel abre directamente el fichaje del día. Si el mes actual todavía no existe, permite abrir el formulario para crearlo.</w:t>
-      </w:r>
-    </w:p>
-    <w:p>
-      <w:pPr>
-        <w:pStyle w:val="Heading2"/>
-      </w:pPr>
-      <w:r>
-        <w:t>4.3 Uso en móvil y tablet</w:t>
+        <w:t>Diferencia diaria y saldo de bolsa.</w:t>
       </w:r>
     </w:p>
     <w:p>
@@ -1178,7 +1161,24 @@
           <w:rFonts w:ascii="Calibri" w:hAnsi="Calibri"/>
           <w:sz w:val="22"/>
         </w:rPr>
-        <w:t>La tabla se transforma en tarjetas para facilitar la lectura.</w:t>
+        <w:t>Marca de teletrabajo.</w:t>
+      </w:r>
+    </w:p>
+    <w:p>
+      <w:r>
+        <w:rPr>
+          <w:rFonts w:ascii="Calibri" w:hAnsi="Calibri"/>
+          <w:sz w:val="22"/>
+        </w:rPr>
+        <w:t>El botón del panel abre directamente el fichaje del día. Si el mes actual todavía no existe, permite abrir el formulario para crearlo.</w:t>
+      </w:r>
+    </w:p>
+    <w:p>
+      <w:pPr>
+        <w:pStyle w:val="Heading2"/>
+      </w:pPr>
+      <w:r>
+        <w:t>4.3 Uso en móvil y tablet</w:t>
       </w:r>
     </w:p>
     <w:p>
@@ -1193,7 +1193,7 @@
           <w:rFonts w:ascii="Calibri" w:hAnsi="Calibri"/>
           <w:sz w:val="22"/>
         </w:rPr>
-        <w:t>Los campos secundarios permanecen disponibles desde el modal de edición.</w:t>
+        <w:t>La tabla se transforma en tarjetas para facilitar la lectura.</w:t>
       </w:r>
     </w:p>
     <w:p>
@@ -1208,6 +1208,21 @@
           <w:rFonts w:ascii="Calibri" w:hAnsi="Calibri"/>
           <w:sz w:val="22"/>
         </w:rPr>
+        <w:t>Los campos secundarios permanecen disponibles desde el modal de edición.</w:t>
+      </w:r>
+    </w:p>
+    <w:p>
+      <w:pPr>
+        <w:numPr>
+          <w:ilvl w:val="0"/>
+          <w:numId w:val="10"/>
+        </w:numPr>
+      </w:pPr>
+      <w:r>
+        <w:rPr>
+          <w:rFonts w:ascii="Calibri" w:hAnsi="Calibri"/>
+          <w:sz w:val="22"/>
+        </w:rPr>
         <w:t xml:space="preserve">El panel lateral se abre con </w:t>
       </w:r>
       <w:r>
@@ -1311,7 +1326,32 @@
           <w:rFonts w:ascii="Calibri" w:hAnsi="Calibri"/>
           <w:sz w:val="22"/>
         </w:rPr>
-        <w:t>Usar las pestañas de la cabecera para cambiar entre meses. Si hay más de 12 meses, se activan los botones de navegación anterior y siguiente.</w:t>
+        <w:t xml:space="preserve">Usar las pestañas de la cabecera para cambiar entre meses. Las etiquetas muestran el mes abreviado y las dos últimas cifras del año, por ejemplo </w:t>
+      </w:r>
+      <w:r>
+        <w:rPr>
+          <w:rFonts w:ascii="Consolas" w:hAnsi="Consolas"/>
+          <w:color w:val="0B2545"/>
+          <w:sz w:val="19"/>
+          <w:shd w:fill="E8EEF5"/>
+        </w:rPr>
+        <w:t>Oct 26</w:t>
+      </w:r>
+      <w:r>
+        <w:rPr>
+          <w:rFonts w:ascii="Calibri" w:hAnsi="Calibri"/>
+          <w:sz w:val="22"/>
+        </w:rPr>
+        <w:t>. Al situar el puntero sobre una pestaña se muestra el mes y el año completos.</w:t>
+      </w:r>
+    </w:p>
+    <w:p>
+      <w:r>
+        <w:rPr>
+          <w:rFonts w:ascii="Calibri" w:hAnsi="Calibri"/>
+          <w:sz w:val="22"/>
+        </w:rPr>
+        <w:t>Cuando los meses no caben en el espacio disponible, aparecen los botones de navegación anterior y siguiente. La aplicación centra el mes activo en la zona visible al cargar o cambiar de mes.</w:t>
       </w:r>
     </w:p>
     <w:p>
@@ -1420,6 +1460,15 @@
           <w:rFonts w:ascii="Calibri" w:hAnsi="Calibri"/>
           <w:sz w:val="22"/>
         </w:rPr>
+        <w:t>El formulario propone el mes siguiente al último creado. Si el último es diciembre, propone enero del año siguiente. Si no hay meses, propone el mes y el año actuales. Se pueden cambiar ambos valores antes de crear el mes.</w:t>
+      </w:r>
+    </w:p>
+    <w:p>
+      <w:r>
+        <w:rPr>
+          <w:rFonts w:ascii="Calibri" w:hAnsi="Calibri"/>
+          <w:sz w:val="22"/>
+        </w:rPr>
         <w:t xml:space="preserve">El mes se genera con días laborables de lunes a viernes. Los festivos nacionales y autonómicos de Andalucía se calculan para el año seleccionado y se marcan automáticamente como </w:t>
       </w:r>
       <w:r>
@@ -3577,41 +3626,16 @@
         <w:pStyle w:val="Heading2"/>
       </w:pPr>
       <w:r>
-        <w:t>9.4 Salida automática de viernes</w:t>
-      </w:r>
-    </w:p>
-    <w:p>
-      <w:r>
-        <w:rPr>
-          <w:rFonts w:ascii="Calibri" w:hAnsi="Calibri"/>
-          <w:sz w:val="22"/>
-        </w:rPr>
-        <w:t>En viernes hábil con entrada registrada y salida vacía, la aplicación calcula una salida automática para ajustar la jornada al saldo de bolsa disponible. La salida calculada aparece destacada como valor automático.</w:t>
-      </w:r>
-    </w:p>
-    <w:p>
-      <w:pPr>
-        <w:pStyle w:val="Heading1"/>
-      </w:pPr>
-      <w:r>
-        <w:t>10. Teletrabajo</w:t>
-      </w:r>
-    </w:p>
-    <w:p>
-      <w:pPr>
-        <w:pStyle w:val="Heading2"/>
-      </w:pPr>
-      <w:r>
-        <w:t>10.1 Configurar bolsa trimestral</w:t>
-      </w:r>
-    </w:p>
-    <w:p>
-      <w:r>
-        <w:rPr>
-          <w:rFonts w:ascii="Calibri" w:hAnsi="Calibri"/>
-          <w:sz w:val="22"/>
-        </w:rPr>
-        <w:t xml:space="preserve">La sección </w:t>
+        <w:t>9.4 Salida recomendada y automática de los viernes</w:t>
+      </w:r>
+    </w:p>
+    <w:p>
+      <w:r>
+        <w:rPr>
+          <w:rFonts w:ascii="Calibri" w:hAnsi="Calibri"/>
+          <w:sz w:val="22"/>
+        </w:rPr>
+        <w:t xml:space="preserve">En viernes hábil con entrada registrada, la aplicación recomienda una hora de salida utilizando el saldo positivo de bolsa disponible al comenzar ese día. Tiene en cuenta la jornada esperada, la hora mínima de entrada y el exceso de desayuno. La recomendación nunca es anterior a la </w:t>
       </w:r>
       <w:r>
         <w:rPr>
@@ -3620,14 +3644,30 @@
           <w:sz w:val="19"/>
           <w:shd w:fill="E8EEF5"/>
         </w:rPr>
-        <w:t>Bolsa teletrabajo</w:t>
-      </w:r>
-      <w:r>
-        <w:rPr>
-          <w:rFonts w:ascii="Calibri" w:hAnsi="Calibri"/>
-          <w:sz w:val="22"/>
-        </w:rPr>
-        <w:t xml:space="preserve"> permite definir una bolsa por trimestre:</w:t>
+        <w:t>Hora mín. salida</w:t>
+      </w:r>
+      <w:r>
+        <w:rPr>
+          <w:rFonts w:ascii="Calibri" w:hAnsi="Calibri"/>
+          <w:sz w:val="22"/>
+        </w:rPr>
+        <w:t xml:space="preserve"> configurada, cuyo valor inicial es </w:t>
+      </w:r>
+      <w:r>
+        <w:rPr>
+          <w:rFonts w:ascii="Consolas" w:hAnsi="Consolas"/>
+          <w:color w:val="0B2545"/>
+          <w:sz w:val="19"/>
+          <w:shd w:fill="E8EEF5"/>
+        </w:rPr>
+        <w:t>13:45</w:t>
+      </w:r>
+      <w:r>
+        <w:rPr>
+          <w:rFonts w:ascii="Calibri" w:hAnsi="Calibri"/>
+          <w:sz w:val="22"/>
+        </w:rPr>
+        <w:t>.</w:t>
       </w:r>
     </w:p>
     <w:p>
@@ -3642,7 +3682,7 @@
           <w:rFonts w:ascii="Calibri" w:hAnsi="Calibri"/>
           <w:sz w:val="22"/>
         </w:rPr>
-        <w:t>T1: enero, febrero y marzo.</w:t>
+        <w:t>Si la salida está vacía, la recomendación se muestra como salida automática y se utiliza para los cálculos de jornada y bolsa.</w:t>
       </w:r>
     </w:p>
     <w:p>
@@ -3657,7 +3697,23 @@
           <w:rFonts w:ascii="Calibri" w:hAnsi="Calibri"/>
           <w:sz w:val="22"/>
         </w:rPr>
-        <w:t>T2: abril, mayo y junio.</w:t>
+        <w:t xml:space="preserve">Si ya hay una salida guardada, se conserva esa hora y se muestra debajo </w:t>
+      </w:r>
+      <w:r>
+        <w:rPr>
+          <w:rFonts w:ascii="Consolas" w:hAnsi="Consolas"/>
+          <w:color w:val="0B2545"/>
+          <w:sz w:val="19"/>
+          <w:shd w:fill="E8EEF5"/>
+        </w:rPr>
+        <w:t>Recomendada: HH:MM</w:t>
+      </w:r>
+      <w:r>
+        <w:rPr>
+          <w:rFonts w:ascii="Calibri" w:hAnsi="Calibri"/>
+          <w:sz w:val="22"/>
+        </w:rPr>
+        <w:t>. Los cálculos siguen usando la salida guardada.</w:t>
       </w:r>
     </w:p>
     <w:p>
@@ -3672,7 +3728,190 @@
           <w:rFonts w:ascii="Calibri" w:hAnsi="Calibri"/>
           <w:sz w:val="22"/>
         </w:rPr>
-        <w:t>T3: julio, agosto y septiembre.</w:t>
+        <w:t xml:space="preserve">En el panel </w:t>
+      </w:r>
+      <w:r>
+        <w:rPr>
+          <w:rFonts w:ascii="Consolas" w:hAnsi="Consolas"/>
+          <w:color w:val="0B2545"/>
+          <w:sz w:val="19"/>
+          <w:shd w:fill="E8EEF5"/>
+        </w:rPr>
+        <w:t>Hoy</w:t>
+      </w:r>
+      <w:r>
+        <w:rPr>
+          <w:rFonts w:ascii="Calibri" w:hAnsi="Calibri"/>
+          <w:sz w:val="22"/>
+        </w:rPr>
+        <w:t xml:space="preserve">, la recomendación aparece como </w:t>
+      </w:r>
+      <w:r>
+        <w:rPr>
+          <w:rFonts w:ascii="Consolas" w:hAnsi="Consolas"/>
+          <w:color w:val="0B2545"/>
+          <w:sz w:val="19"/>
+          <w:shd w:fill="E8EEF5"/>
+        </w:rPr>
+        <w:t>Salida prevista</w:t>
+      </w:r>
+      <w:r>
+        <w:rPr>
+          <w:rFonts w:ascii="Calibri" w:hAnsi="Calibri"/>
+          <w:sz w:val="22"/>
+        </w:rPr>
+        <w:t xml:space="preserve"> cuando no hay salida guardada, o como </w:t>
+      </w:r>
+      <w:r>
+        <w:rPr>
+          <w:rFonts w:ascii="Consolas" w:hAnsi="Consolas"/>
+          <w:color w:val="0B2545"/>
+          <w:sz w:val="19"/>
+          <w:shd w:fill="E8EEF5"/>
+        </w:rPr>
+        <w:t>Salida recomendada</w:t>
+      </w:r>
+      <w:r>
+        <w:rPr>
+          <w:rFonts w:ascii="Calibri" w:hAnsi="Calibri"/>
+          <w:sz w:val="22"/>
+        </w:rPr>
+        <w:t xml:space="preserve"> junto a la salida existente.</w:t>
+      </w:r>
+    </w:p>
+    <w:p>
+      <w:r>
+        <w:rPr>
+          <w:rFonts w:ascii="Calibri" w:hAnsi="Calibri"/>
+          <w:sz w:val="22"/>
+        </w:rPr>
+        <w:t>Si no hay bolsa positiva, la recomendación corresponde a completar la jornada ordinaria, respetando la hora mínima de salida. Para registrar la salida real, editar el fichaje y guardar la hora correspondiente.</w:t>
+      </w:r>
+    </w:p>
+    <w:p>
+      <w:pPr>
+        <w:pStyle w:val="Heading1"/>
+      </w:pPr>
+      <w:r>
+        <w:t>10. Teletrabajo</w:t>
+      </w:r>
+    </w:p>
+    <w:p>
+      <w:pPr>
+        <w:pStyle w:val="Heading2"/>
+      </w:pPr>
+      <w:r>
+        <w:t>10.1 Configurar bolsas trimestrales por año</w:t>
+      </w:r>
+    </w:p>
+    <w:p>
+      <w:r>
+        <w:rPr>
+          <w:rFonts w:ascii="Calibri" w:hAnsi="Calibri"/>
+          <w:sz w:val="22"/>
+        </w:rPr>
+        <w:t>Cada año dispone de cuatro bolsas trimestrales independientes. Se pueden configurar antes de crear los meses de ese año.</w:t>
+      </w:r>
+    </w:p>
+    <w:p>
+      <w:pPr>
+        <w:numPr>
+          <w:ilvl w:val="0"/>
+          <w:numId w:val="19"/>
+        </w:numPr>
+      </w:pPr>
+      <w:r>
+        <w:rPr>
+          <w:rFonts w:ascii="Calibri" w:hAnsi="Calibri"/>
+          <w:sz w:val="22"/>
+        </w:rPr>
+        <w:t xml:space="preserve">Abrir </w:t>
+      </w:r>
+      <w:r>
+        <w:rPr>
+          <w:rFonts w:ascii="Consolas" w:hAnsi="Consolas"/>
+          <w:color w:val="0B2545"/>
+          <w:sz w:val="19"/>
+          <w:shd w:fill="E8EEF5"/>
+        </w:rPr>
+        <w:t>Bolsa teletrabajo</w:t>
+      </w:r>
+      <w:r>
+        <w:rPr>
+          <w:rFonts w:ascii="Calibri" w:hAnsi="Calibri"/>
+          <w:sz w:val="22"/>
+        </w:rPr>
+        <w:t xml:space="preserve"> en el panel lateral.</w:t>
+      </w:r>
+    </w:p>
+    <w:p>
+      <w:pPr>
+        <w:numPr>
+          <w:ilvl w:val="0"/>
+          <w:numId w:val="19"/>
+        </w:numPr>
+      </w:pPr>
+      <w:r>
+        <w:rPr>
+          <w:rFonts w:ascii="Calibri" w:hAnsi="Calibri"/>
+          <w:sz w:val="22"/>
+        </w:rPr>
+        <w:t xml:space="preserve">Introducir el año en </w:t>
+      </w:r>
+      <w:r>
+        <w:rPr>
+          <w:rFonts w:ascii="Consolas" w:hAnsi="Consolas"/>
+          <w:color w:val="0B2545"/>
+          <w:sz w:val="19"/>
+          <w:shd w:fill="E8EEF5"/>
+        </w:rPr>
+        <w:t>Año de las bolsas trimestrales</w:t>
+      </w:r>
+      <w:r>
+        <w:rPr>
+          <w:rFonts w:ascii="Calibri" w:hAnsi="Calibri"/>
+          <w:sz w:val="22"/>
+        </w:rPr>
+        <w:t>, entre 2020 y 2099.</w:t>
+      </w:r>
+    </w:p>
+    <w:p>
+      <w:pPr>
+        <w:numPr>
+          <w:ilvl w:val="0"/>
+          <w:numId w:val="19"/>
+        </w:numPr>
+      </w:pPr>
+      <w:r>
+        <w:rPr>
+          <w:rFonts w:ascii="Calibri" w:hAnsi="Calibri"/>
+          <w:sz w:val="22"/>
+        </w:rPr>
+        <w:t>Rellenar las bolsas de los trimestres que corresponda.</w:t>
+      </w:r>
+    </w:p>
+    <w:p>
+      <w:pPr>
+        <w:numPr>
+          <w:ilvl w:val="0"/>
+          <w:numId w:val="19"/>
+        </w:numPr>
+      </w:pPr>
+      <w:r>
+        <w:rPr>
+          <w:rFonts w:ascii="Calibri" w:hAnsi="Calibri"/>
+          <w:sz w:val="22"/>
+        </w:rPr>
+        <w:t>Salir del campo para guardar el valor y comprobar el indicador de sincronización.</w:t>
+      </w:r>
+    </w:p>
+    <w:p>
+      <w:r>
+        <w:rPr>
+          <w:rFonts w:ascii="Calibri" w:hAnsi="Calibri"/>
+          <w:sz w:val="22"/>
+        </w:rPr>
+        <w:t>Los trimestres son:</w:t>
       </w:r>
     </w:p>
     <w:p>
@@ -3687,6 +3926,51 @@
           <w:rFonts w:ascii="Calibri" w:hAnsi="Calibri"/>
           <w:sz w:val="22"/>
         </w:rPr>
+        <w:t>T1: enero, febrero y marzo.</w:t>
+      </w:r>
+    </w:p>
+    <w:p>
+      <w:pPr>
+        <w:numPr>
+          <w:ilvl w:val="0"/>
+          <w:numId w:val="10"/>
+        </w:numPr>
+      </w:pPr>
+      <w:r>
+        <w:rPr>
+          <w:rFonts w:ascii="Calibri" w:hAnsi="Calibri"/>
+          <w:sz w:val="22"/>
+        </w:rPr>
+        <w:t>T2: abril, mayo y junio.</w:t>
+      </w:r>
+    </w:p>
+    <w:p>
+      <w:pPr>
+        <w:numPr>
+          <w:ilvl w:val="0"/>
+          <w:numId w:val="10"/>
+        </w:numPr>
+      </w:pPr>
+      <w:r>
+        <w:rPr>
+          <w:rFonts w:ascii="Calibri" w:hAnsi="Calibri"/>
+          <w:sz w:val="22"/>
+        </w:rPr>
+        <w:t>T3: julio, agosto y septiembre.</w:t>
+      </w:r>
+    </w:p>
+    <w:p>
+      <w:pPr>
+        <w:numPr>
+          <w:ilvl w:val="0"/>
+          <w:numId w:val="10"/>
+        </w:numPr>
+      </w:pPr>
+      <w:r>
+        <w:rPr>
+          <w:rFonts w:ascii="Calibri" w:hAnsi="Calibri"/>
+          <w:sz w:val="22"/>
+        </w:rPr>
         <w:t>T4: octubre, noviembre y diciembre.</w:t>
       </w:r>
     </w:p>
@@ -3712,7 +3996,89 @@
           <w:rFonts w:ascii="Calibri" w:hAnsi="Calibri"/>
           <w:sz w:val="22"/>
         </w:rPr>
-        <w:t>.</w:t>
+        <w:t xml:space="preserve"> y admite duraciones superiores a 23 horas, por ejemplo </w:t>
+      </w:r>
+      <w:r>
+        <w:rPr>
+          <w:rFonts w:ascii="Consolas" w:hAnsi="Consolas"/>
+          <w:color w:val="0B2545"/>
+          <w:sz w:val="19"/>
+          <w:shd w:fill="E8EEF5"/>
+        </w:rPr>
+        <w:t>120:00</w:t>
+      </w:r>
+      <w:r>
+        <w:rPr>
+          <w:rFonts w:ascii="Calibri" w:hAnsi="Calibri"/>
+          <w:sz w:val="22"/>
+        </w:rPr>
+        <w:t xml:space="preserve">. Los minutos deben estar entre </w:t>
+      </w:r>
+      <w:r>
+        <w:rPr>
+          <w:rFonts w:ascii="Consolas" w:hAnsi="Consolas"/>
+          <w:color w:val="0B2545"/>
+          <w:sz w:val="19"/>
+          <w:shd w:fill="E8EEF5"/>
+        </w:rPr>
+        <w:t>00</w:t>
+      </w:r>
+      <w:r>
+        <w:rPr>
+          <w:rFonts w:ascii="Calibri" w:hAnsi="Calibri"/>
+          <w:sz w:val="22"/>
+        </w:rPr>
+        <w:t xml:space="preserve"> y </w:t>
+      </w:r>
+      <w:r>
+        <w:rPr>
+          <w:rFonts w:ascii="Consolas" w:hAnsi="Consolas"/>
+          <w:color w:val="0B2545"/>
+          <w:sz w:val="19"/>
+          <w:shd w:fill="E8EEF5"/>
+        </w:rPr>
+        <w:t>59</w:t>
+      </w:r>
+      <w:r>
+        <w:rPr>
+          <w:rFonts w:ascii="Calibri" w:hAnsi="Calibri"/>
+          <w:sz w:val="22"/>
+        </w:rPr>
+        <w:t>. Un valor inválido se marca en rojo y no sustituye el último valor válido.</w:t>
+      </w:r>
+    </w:p>
+    <w:p>
+      <w:r>
+        <w:rPr>
+          <w:rFonts w:ascii="Calibri" w:hAnsi="Calibri"/>
+          <w:sz w:val="22"/>
+        </w:rPr>
+        <w:t>Al cambiar de mes, el panel muestra automáticamente las bolsas del año de ese mes. Cambiar solo el año del panel permite configurar otro año sin cambiar el mes seleccionado.</w:t>
+      </w:r>
+    </w:p>
+    <w:p>
+      <w:r>
+        <w:rPr>
+          <w:rFonts w:ascii="Calibri" w:hAnsi="Calibri"/>
+          <w:sz w:val="22"/>
+        </w:rPr>
+        <w:t xml:space="preserve">Los años sin configurar empiezan con las cuatro bolsas en </w:t>
+      </w:r>
+      <w:r>
+        <w:rPr>
+          <w:rFonts w:ascii="Consolas" w:hAnsi="Consolas"/>
+          <w:color w:val="0B2545"/>
+          <w:sz w:val="19"/>
+          <w:shd w:fill="E8EEF5"/>
+        </w:rPr>
+        <w:t>00:00</w:t>
+      </w:r>
+      <w:r>
+        <w:rPr>
+          <w:rFonts w:ascii="Calibri" w:hAnsi="Calibri"/>
+          <w:sz w:val="22"/>
+        </w:rPr>
+        <w:t>. Las bolsas que existían antes de la configuración anual se conservan en 2026; no se copian automáticamente a otros años.</w:t>
       </w:r>
     </w:p>
     <w:p>
@@ -3833,7 +4199,7 @@
           <w:rFonts w:ascii="Calibri" w:hAnsi="Calibri"/>
           <w:sz w:val="22"/>
         </w:rPr>
-        <w:t>La columna de teletrabajo muestra la bolsa restante del trimestre cuando el día tiene una marca activa.</w:t>
+        <w:t>La columna de teletrabajo muestra la bolsa restante del trimestre cuando el día tiene una marca activa. El consumo se acumula entre los meses del mismo trimestre y año. Las bolsas y los consumos de otros años se calculan de forma independiente.</w:t>
       </w:r>
     </w:p>
     <w:p>
@@ -3850,32 +4216,7 @@
           <w:rFonts w:ascii="Calibri" w:hAnsi="Calibri"/>
           <w:sz w:val="22"/>
         </w:rPr>
-        <w:t>Si un trimestre queda excedido, el panel lateral muestra un aviso indicando el trimestre afectado y el exceso.</w:t>
-      </w:r>
-    </w:p>
-    <w:p>
-      <w:pPr>
-        <w:pStyle w:val="Heading1"/>
-      </w:pPr>
-      <w:r>
-        <w:t>11. Resumen y estadísticas</w:t>
-      </w:r>
-    </w:p>
-    <w:p>
-      <w:pPr>
-        <w:pStyle w:val="Heading2"/>
-      </w:pPr>
-      <w:r>
-        <w:t>11.1 Resumen del mes</w:t>
-      </w:r>
-    </w:p>
-    <w:p>
-      <w:r>
-        <w:rPr>
-          <w:rFonts w:ascii="Calibri" w:hAnsi="Calibri"/>
-          <w:sz w:val="22"/>
-        </w:rPr>
-        <w:t xml:space="preserve">La sección </w:t>
+        <w:t xml:space="preserve">Si un trimestre queda excedido, el panel lateral muestra un aviso indicando el año, el trimestre afectado y el exceso. Los avisos corresponden al año elegido en </w:t>
       </w:r>
       <w:r>
         <w:rPr>
@@ -3884,6 +4225,47 @@
           <w:sz w:val="19"/>
           <w:shd w:fill="E8EEF5"/>
         </w:rPr>
+        <w:t>Año de las bolsas trimestrales</w:t>
+      </w:r>
+      <w:r>
+        <w:rPr>
+          <w:rFonts w:ascii="Calibri" w:hAnsi="Calibri"/>
+          <w:sz w:val="22"/>
+        </w:rPr>
+        <w:t>.</w:t>
+      </w:r>
+    </w:p>
+    <w:p>
+      <w:pPr>
+        <w:pStyle w:val="Heading1"/>
+      </w:pPr>
+      <w:r>
+        <w:t>11. Resumen y estadísticas</w:t>
+      </w:r>
+    </w:p>
+    <w:p>
+      <w:pPr>
+        <w:pStyle w:val="Heading2"/>
+      </w:pPr>
+      <w:r>
+        <w:t>11.1 Resumen del mes</w:t>
+      </w:r>
+    </w:p>
+    <w:p>
+      <w:r>
+        <w:rPr>
+          <w:rFonts w:ascii="Calibri" w:hAnsi="Calibri"/>
+          <w:sz w:val="22"/>
+        </w:rPr>
+        <w:t xml:space="preserve">La sección </w:t>
+      </w:r>
+      <w:r>
+        <w:rPr>
+          <w:rFonts w:ascii="Consolas" w:hAnsi="Consolas"/>
+          <w:color w:val="0B2545"/>
+          <w:sz w:val="19"/>
+          <w:shd w:fill="E8EEF5"/>
+        </w:rPr>
         <w:t>Resumen del mes</w:t>
       </w:r>
       <w:r>
@@ -3985,6 +4367,36 @@
       </w:r>
     </w:p>
     <w:p>
+      <w:pPr>
+        <w:numPr>
+          <w:ilvl w:val="0"/>
+          <w:numId w:val="10"/>
+        </w:numPr>
+      </w:pPr>
+      <w:r>
+        <w:rPr>
+          <w:rFonts w:ascii="Calibri" w:hAnsi="Calibri"/>
+          <w:sz w:val="22"/>
+        </w:rPr>
+        <w:t>Horas mañana / tarde: porcentajes de distribución del tiempo.</w:t>
+      </w:r>
+    </w:p>
+    <w:p>
+      <w:pPr>
+        <w:numPr>
+          <w:ilvl w:val="0"/>
+          <w:numId w:val="10"/>
+        </w:numPr>
+      </w:pPr>
+      <w:r>
+        <w:rPr>
+          <w:rFonts w:ascii="Calibri" w:hAnsi="Calibri"/>
+          <w:sz w:val="22"/>
+        </w:rPr>
+        <w:t>Jornada partida / única: número de días de cada modalidad.</w:t>
+      </w:r>
+    </w:p>
+    <w:p>
       <w:r>
         <w:rPr>
           <w:rFonts w:ascii="Calibri" w:hAnsi="Calibri"/>
@@ -4179,7 +4591,7 @@
           <w:rFonts w:ascii="Calibri" w:hAnsi="Calibri"/>
           <w:sz w:val="22"/>
         </w:rPr>
-        <w:t>Teletrabajo disponible y consumido en el trimestre natural correspondiente.</w:t>
+        <w:t>Teletrabajo disponible y consumido en el trimestre natural y año del mes seleccionado, aunque se consulte otro periodo de estadísticas.</w:t>
       </w:r>
     </w:p>
     <w:p>
@@ -4198,15 +4610,6 @@
       </w:r>
     </w:p>
     <w:p>
-      <w:r>
-        <w:rPr>
-          <w:rFonts w:ascii="Calibri" w:hAnsi="Calibri"/>
-          <w:sz w:val="22"/>
-        </w:rPr>
-        <w:t>Los gráficos y paneles muestran:</w:t>
-      </w:r>
-    </w:p>
-    <w:p>
       <w:pPr>
         <w:numPr>
           <w:ilvl w:val="0"/>
@@ -4218,7 +4621,7 @@
           <w:rFonts w:ascii="Calibri" w:hAnsi="Calibri"/>
           <w:sz w:val="22"/>
         </w:rPr>
-        <w:t>Evolución de la bolsa por día.</w:t>
+        <w:t>Porcentajes de horas de mañana y de tarde.</w:t>
       </w:r>
     </w:p>
     <w:p>
@@ -4233,7 +4636,16 @@
           <w:rFonts w:ascii="Calibri" w:hAnsi="Calibri"/>
           <w:sz w:val="22"/>
         </w:rPr>
-        <w:t>Horas trabajadas frente a esperadas, agrupadas por semana o mes.</w:t>
+        <w:t>Número de jornadas partidas y únicas.</w:t>
+      </w:r>
+    </w:p>
+    <w:p>
+      <w:r>
+        <w:rPr>
+          <w:rFonts w:ascii="Calibri" w:hAnsi="Calibri"/>
+          <w:sz w:val="22"/>
+        </w:rPr>
+        <w:t>Los gráficos y paneles muestran:</w:t>
       </w:r>
     </w:p>
     <w:p>
@@ -4248,7 +4660,7 @@
           <w:rFonts w:ascii="Calibri" w:hAnsi="Calibri"/>
           <w:sz w:val="22"/>
         </w:rPr>
-        <w:t>Distribución de días por tipo.</w:t>
+        <w:t>Evolución de la bolsa por día.</w:t>
       </w:r>
     </w:p>
     <w:p>
@@ -4263,39 +4675,14 @@
           <w:rFonts w:ascii="Calibri" w:hAnsi="Calibri"/>
           <w:sz w:val="22"/>
         </w:rPr>
-        <w:t>Incidencias: fichajes pendientes, bolsa negativa o teletrabajo excedido.</w:t>
-      </w:r>
-    </w:p>
-    <w:p>
-      <w:r>
-        <w:rPr>
-          <w:rFonts w:ascii="Calibri" w:hAnsi="Calibri"/>
-          <w:sz w:val="22"/>
-        </w:rPr>
-        <w:t>Los días futuros no se incluyen como tiempo pendiente en los indicadores.</w:t>
-      </w:r>
-    </w:p>
-    <w:p>
-      <w:pPr>
-        <w:pStyle w:val="Heading1"/>
-      </w:pPr>
-      <w:r>
-        <w:t>12. Copias de seguridad</w:t>
-      </w:r>
-    </w:p>
-    <w:p>
-      <w:pPr>
-        <w:pStyle w:val="Heading2"/>
-      </w:pPr>
-      <w:r>
-        <w:t>12.1 Exportar backup JSON</w:t>
+        <w:t>Horas trabajadas frente a esperadas, agrupadas por semana o mes.</w:t>
       </w:r>
     </w:p>
     <w:p>
       <w:pPr>
         <w:numPr>
           <w:ilvl w:val="0"/>
-          <w:numId w:val="19"/>
+          <w:numId w:val="10"/>
         </w:numPr>
       </w:pPr>
       <w:r>
@@ -4303,7 +4690,48 @@
           <w:rFonts w:ascii="Calibri" w:hAnsi="Calibri"/>
           <w:sz w:val="22"/>
         </w:rPr>
-        <w:t xml:space="preserve">Ir a </w:t>
+        <w:t>Distribución de días por tipo.</w:t>
+      </w:r>
+    </w:p>
+    <w:p>
+      <w:pPr>
+        <w:numPr>
+          <w:ilvl w:val="0"/>
+          <w:numId w:val="10"/>
+        </w:numPr>
+      </w:pPr>
+      <w:r>
+        <w:rPr>
+          <w:rFonts w:ascii="Calibri" w:hAnsi="Calibri"/>
+          <w:sz w:val="22"/>
+        </w:rPr>
+        <w:t>Incidencias: fichajes pendientes, bolsa negativa o teletrabajo excedido.</w:t>
+      </w:r>
+    </w:p>
+    <w:p>
+      <w:r>
+        <w:rPr>
+          <w:rFonts w:ascii="Calibri" w:hAnsi="Calibri"/>
+          <w:sz w:val="22"/>
+        </w:rPr>
+        <w:t>Los días futuros no se incluyen como tiempo pendiente en los indicadores.</w:t>
+      </w:r>
+    </w:p>
+    <w:p>
+      <w:pPr>
+        <w:pStyle w:val="Heading2"/>
+      </w:pPr>
+      <w:r>
+        <w:t>11.3 Distribución de horas y tipos de jornada</w:t>
+      </w:r>
+    </w:p>
+    <w:p>
+      <w:r>
+        <w:rPr>
+          <w:rFonts w:ascii="Calibri" w:hAnsi="Calibri"/>
+          <w:sz w:val="22"/>
+        </w:rPr>
+        <w:t xml:space="preserve">Los indicadores </w:t>
       </w:r>
       <w:r>
         <w:rPr>
@@ -4312,29 +4740,14 @@
           <w:sz w:val="19"/>
           <w:shd w:fill="E8EEF5"/>
         </w:rPr>
-        <w:t>Backup completo</w:t>
-      </w:r>
-      <w:r>
-        <w:rPr>
-          <w:rFonts w:ascii="Calibri" w:hAnsi="Calibri"/>
-          <w:sz w:val="22"/>
-        </w:rPr>
-        <w:t>.</w:t>
-      </w:r>
-    </w:p>
-    <w:p>
-      <w:pPr>
-        <w:numPr>
-          <w:ilvl w:val="0"/>
-          <w:numId w:val="19"/>
-        </w:numPr>
-      </w:pPr>
-      <w:r>
-        <w:rPr>
-          <w:rFonts w:ascii="Calibri" w:hAnsi="Calibri"/>
-          <w:sz w:val="22"/>
-        </w:rPr>
-        <w:t xml:space="preserve">Pulsar </w:t>
+        <w:t>Horas mañana / tarde</w:t>
+      </w:r>
+      <w:r>
+        <w:rPr>
+          <w:rFonts w:ascii="Calibri" w:hAnsi="Calibri"/>
+          <w:sz w:val="22"/>
+        </w:rPr>
+        <w:t xml:space="preserve"> y </w:t>
       </w:r>
       <w:r>
         <w:rPr>
@@ -4343,7 +4756,23 @@
           <w:sz w:val="19"/>
           <w:shd w:fill="E8EEF5"/>
         </w:rPr>
-        <w:t>Exportar JSON</w:t>
+        <w:t>Jornada partida / única</w:t>
+      </w:r>
+      <w:r>
+        <w:rPr>
+          <w:rFonts w:ascii="Calibri" w:hAnsi="Calibri"/>
+          <w:sz w:val="22"/>
+        </w:rPr>
+        <w:t xml:space="preserve"> aparecen tanto en el resumen mensual del panel lateral como en </w:t>
+      </w:r>
+      <w:r>
+        <w:rPr>
+          <w:rFonts w:ascii="Consolas" w:hAnsi="Consolas"/>
+          <w:color w:val="0B2545"/>
+          <w:sz w:val="19"/>
+          <w:shd w:fill="E8EEF5"/>
+        </w:rPr>
+        <w:t>ESTADÍSTICAS</w:t>
       </w:r>
       <w:r>
         <w:rPr>
@@ -4351,15 +4780,6 @@
           <w:sz w:val="22"/>
         </w:rPr>
         <w:t>.</w:t>
-      </w:r>
-    </w:p>
-    <w:p>
-      <w:r>
-        <w:rPr>
-          <w:rFonts w:ascii="Calibri" w:hAnsi="Calibri"/>
-          <w:sz w:val="22"/>
-        </w:rPr>
-        <w:t>El archivo generado contiene:</w:t>
       </w:r>
     </w:p>
     <w:p>
@@ -4374,7 +4794,7 @@
           <w:rFonts w:ascii="Calibri" w:hAnsi="Calibri"/>
           <w:sz w:val="22"/>
         </w:rPr>
-        <w:t>Configuración.</w:t>
+        <w:t>Jornada partida: un día hábil computable con inicio y fin de comida registrados. El tramo de mañana llega hasta el inicio de comida y el de tarde comienza al terminarla. La hora mínima de entrada y el exceso de desayuno ajustan el tramo de mañana.</w:t>
       </w:r>
     </w:p>
     <w:p>
@@ -4389,7 +4809,7 @@
           <w:rFonts w:ascii="Calibri" w:hAnsi="Calibri"/>
           <w:sz w:val="22"/>
         </w:rPr>
-        <w:t>Todos los meses.</w:t>
+        <w:t>Jornada única: un día hábil computable sin un tramo completo de comida. Todo el tiempo computado se asigna a mañana, aunque la salida sea por la tarde.</w:t>
       </w:r>
     </w:p>
     <w:p>
@@ -4404,7 +4824,135 @@
           <w:rFonts w:ascii="Calibri" w:hAnsi="Calibri"/>
           <w:sz w:val="22"/>
         </w:rPr>
-        <w:t>Todos los fichajes.</w:t>
+        <w:t xml:space="preserve">Horas mañana / tarde: porcentajes sobre la suma de esos tramos, redondeados a números enteros. Si no hay tiempo computable, ambos muestran </w:t>
+      </w:r>
+      <w:r>
+        <w:rPr>
+          <w:rFonts w:ascii="Consolas" w:hAnsi="Consolas"/>
+          <w:color w:val="0B2545"/>
+          <w:sz w:val="19"/>
+          <w:shd w:fill="E8EEF5"/>
+        </w:rPr>
+        <w:t>0%</w:t>
+      </w:r>
+      <w:r>
+        <w:rPr>
+          <w:rFonts w:ascii="Calibri" w:hAnsi="Calibri"/>
+          <w:sz w:val="22"/>
+        </w:rPr>
+        <w:t>.</w:t>
+      </w:r>
+    </w:p>
+    <w:p>
+      <w:r>
+        <w:rPr>
+          <w:rFonts w:ascii="Calibri" w:hAnsi="Calibri"/>
+          <w:sz w:val="22"/>
+        </w:rPr>
+        <w:t xml:space="preserve">El reparto describe los tramos horarios. La columna </w:t>
+      </w:r>
+      <w:r>
+        <w:rPr>
+          <w:rFonts w:ascii="Consolas" w:hAnsi="Consolas"/>
+          <w:color w:val="0B2545"/>
+          <w:sz w:val="19"/>
+          <w:shd w:fill="E8EEF5"/>
+        </w:rPr>
+        <w:t>Suma</w:t>
+      </w:r>
+      <w:r>
+        <w:rPr>
+          <w:rFonts w:ascii="Calibri" w:hAnsi="Calibri"/>
+          <w:sz w:val="22"/>
+        </w:rPr>
+        <w:t xml:space="preserve"> sigue aplicando sus descuentos y límites de jornada. El resumen lateral utiliza los registros del mes completo; el dashboard utiliza el periodo elegido y solo incluye días transcurridos.</w:t>
+      </w:r>
+    </w:p>
+    <w:p>
+      <w:pPr>
+        <w:pStyle w:val="Heading1"/>
+      </w:pPr>
+      <w:r>
+        <w:t>12. Copias de seguridad</w:t>
+      </w:r>
+    </w:p>
+    <w:p>
+      <w:pPr>
+        <w:pStyle w:val="Heading2"/>
+      </w:pPr>
+      <w:r>
+        <w:t>12.1 Exportar backup JSON</w:t>
+      </w:r>
+    </w:p>
+    <w:p>
+      <w:pPr>
+        <w:numPr>
+          <w:ilvl w:val="0"/>
+          <w:numId w:val="20"/>
+        </w:numPr>
+      </w:pPr>
+      <w:r>
+        <w:rPr>
+          <w:rFonts w:ascii="Calibri" w:hAnsi="Calibri"/>
+          <w:sz w:val="22"/>
+        </w:rPr>
+        <w:t xml:space="preserve">Ir a </w:t>
+      </w:r>
+      <w:r>
+        <w:rPr>
+          <w:rFonts w:ascii="Consolas" w:hAnsi="Consolas"/>
+          <w:color w:val="0B2545"/>
+          <w:sz w:val="19"/>
+          <w:shd w:fill="E8EEF5"/>
+        </w:rPr>
+        <w:t>Backup completo</w:t>
+      </w:r>
+      <w:r>
+        <w:rPr>
+          <w:rFonts w:ascii="Calibri" w:hAnsi="Calibri"/>
+          <w:sz w:val="22"/>
+        </w:rPr>
+        <w:t>.</w:t>
+      </w:r>
+    </w:p>
+    <w:p>
+      <w:pPr>
+        <w:numPr>
+          <w:ilvl w:val="0"/>
+          <w:numId w:val="20"/>
+        </w:numPr>
+      </w:pPr>
+      <w:r>
+        <w:rPr>
+          <w:rFonts w:ascii="Calibri" w:hAnsi="Calibri"/>
+          <w:sz w:val="22"/>
+        </w:rPr>
+        <w:t xml:space="preserve">Pulsar </w:t>
+      </w:r>
+      <w:r>
+        <w:rPr>
+          <w:rFonts w:ascii="Consolas" w:hAnsi="Consolas"/>
+          <w:color w:val="0B2545"/>
+          <w:sz w:val="19"/>
+          <w:shd w:fill="E8EEF5"/>
+        </w:rPr>
+        <w:t>Exportar JSON</w:t>
+      </w:r>
+      <w:r>
+        <w:rPr>
+          <w:rFonts w:ascii="Calibri" w:hAnsi="Calibri"/>
+          <w:sz w:val="22"/>
+        </w:rPr>
+        <w:t>.</w:t>
+      </w:r>
+    </w:p>
+    <w:p>
+      <w:r>
+        <w:rPr>
+          <w:rFonts w:ascii="Calibri" w:hAnsi="Calibri"/>
+          <w:sz w:val="22"/>
+        </w:rPr>
+        <w:t>El archivo generado contiene:</w:t>
       </w:r>
     </w:p>
     <w:p>
@@ -4419,7 +4967,7 @@
           <w:rFonts w:ascii="Calibri" w:hAnsi="Calibri"/>
           <w:sz w:val="22"/>
         </w:rPr>
-        <w:t>Tipos de día.</w:t>
+        <w:t>Configuración, incluidos los calendarios personalizados de festivos y las bolsas de teletrabajo de todos los años.</w:t>
       </w:r>
     </w:p>
     <w:p>
@@ -4434,7 +4982,7 @@
           <w:rFonts w:ascii="Calibri" w:hAnsi="Calibri"/>
           <w:sz w:val="22"/>
         </w:rPr>
-        <w:t>Notas.</w:t>
+        <w:t>Todos los meses.</w:t>
       </w:r>
     </w:p>
     <w:p>
@@ -4449,31 +4997,76 @@
           <w:rFonts w:ascii="Calibri" w:hAnsi="Calibri"/>
           <w:sz w:val="22"/>
         </w:rPr>
-        <w:t>Marcas de teletrabajo.</w:t>
-      </w:r>
-    </w:p>
-    <w:p>
-      <w:r>
-        <w:rPr>
-          <w:rFonts w:ascii="Calibri" w:hAnsi="Calibri"/>
-          <w:sz w:val="22"/>
-        </w:rPr>
-        <w:t>Uso recomendado: copia completa de seguridad o migración entre navegadores/dispositivos.</w:t>
-      </w:r>
-    </w:p>
-    <w:p>
-      <w:pPr>
-        <w:pStyle w:val="Heading2"/>
-      </w:pPr>
-      <w:r>
-        <w:t>12.2 Importar backup JSON</w:t>
+        <w:t>Todos los fichajes.</w:t>
       </w:r>
     </w:p>
     <w:p>
       <w:pPr>
         <w:numPr>
           <w:ilvl w:val="0"/>
-          <w:numId w:val="20"/>
+          <w:numId w:val="10"/>
+        </w:numPr>
+      </w:pPr>
+      <w:r>
+        <w:rPr>
+          <w:rFonts w:ascii="Calibri" w:hAnsi="Calibri"/>
+          <w:sz w:val="22"/>
+        </w:rPr>
+        <w:t>Tipos de día.</w:t>
+      </w:r>
+    </w:p>
+    <w:p>
+      <w:pPr>
+        <w:numPr>
+          <w:ilvl w:val="0"/>
+          <w:numId w:val="10"/>
+        </w:numPr>
+      </w:pPr>
+      <w:r>
+        <w:rPr>
+          <w:rFonts w:ascii="Calibri" w:hAnsi="Calibri"/>
+          <w:sz w:val="22"/>
+        </w:rPr>
+        <w:t>Notas.</w:t>
+      </w:r>
+    </w:p>
+    <w:p>
+      <w:pPr>
+        <w:numPr>
+          <w:ilvl w:val="0"/>
+          <w:numId w:val="10"/>
+        </w:numPr>
+      </w:pPr>
+      <w:r>
+        <w:rPr>
+          <w:rFonts w:ascii="Calibri" w:hAnsi="Calibri"/>
+          <w:sz w:val="22"/>
+        </w:rPr>
+        <w:t>Marcas de teletrabajo.</w:t>
+      </w:r>
+    </w:p>
+    <w:p>
+      <w:r>
+        <w:rPr>
+          <w:rFonts w:ascii="Calibri" w:hAnsi="Calibri"/>
+          <w:sz w:val="22"/>
+        </w:rPr>
+        <w:t>Uso recomendado: copia completa de seguridad o migración entre navegadores/dispositivos.</w:t>
+      </w:r>
+    </w:p>
+    <w:p>
+      <w:pPr>
+        <w:pStyle w:val="Heading2"/>
+      </w:pPr>
+      <w:r>
+        <w:t>12.2 Importar backup JSON</w:t>
+      </w:r>
+    </w:p>
+    <w:p>
+      <w:pPr>
+        <w:numPr>
+          <w:ilvl w:val="0"/>
+          <w:numId w:val="21"/>
         </w:numPr>
       </w:pPr>
       <w:r>
@@ -4504,7 +5097,7 @@
       <w:pPr>
         <w:numPr>
           <w:ilvl w:val="0"/>
-          <w:numId w:val="20"/>
+          <w:numId w:val="21"/>
         </w:numPr>
       </w:pPr>
       <w:r>
@@ -4535,7 +5128,7 @@
       <w:pPr>
         <w:numPr>
           <w:ilvl w:val="0"/>
-          <w:numId w:val="20"/>
+          <w:numId w:val="21"/>
         </w:numPr>
       </w:pPr>
       <w:r>
@@ -4544,46 +5137,6 @@
           <w:sz w:val="22"/>
         </w:rPr>
         <w:t>Seleccionar o arrastrar el archivo.</w:t>
-      </w:r>
-    </w:p>
-    <w:p>
-      <w:pPr>
-        <w:numPr>
-          <w:ilvl w:val="0"/>
-          <w:numId w:val="20"/>
-        </w:numPr>
-      </w:pPr>
-      <w:r>
-        <w:rPr>
-          <w:rFonts w:ascii="Calibri" w:hAnsi="Calibri"/>
-          <w:sz w:val="22"/>
-        </w:rPr>
-        <w:t>Confirmar la sustitución de datos.</w:t>
-      </w:r>
-    </w:p>
-    <w:p>
-      <w:r>
-        <w:rPr>
-          <w:rFonts w:ascii="Calibri" w:hAnsi="Calibri"/>
-          <w:sz w:val="22"/>
-        </w:rPr>
-        <w:t>La importación JSON reemplaza todos los datos actuales por los del archivo.</w:t>
-      </w:r>
-    </w:p>
-    <w:p>
-      <w:pPr>
-        <w:pStyle w:val="Heading1"/>
-      </w:pPr>
-      <w:r>
-        <w:t>13. Exportación e importación mensual</w:t>
-      </w:r>
-    </w:p>
-    <w:p>
-      <w:pPr>
-        <w:pStyle w:val="Heading2"/>
-      </w:pPr>
-      <w:r>
-        <w:t>13.1 Exportar CSV del mes</w:t>
       </w:r>
     </w:p>
     <w:p>
@@ -4598,14 +5151,63 @@
           <w:rFonts w:ascii="Calibri" w:hAnsi="Calibri"/>
           <w:sz w:val="22"/>
         </w:rPr>
-        <w:t>Seleccionar el mes.</w:t>
+        <w:t>Confirmar la sustitución de datos.</w:t>
+      </w:r>
+    </w:p>
+    <w:p>
+      <w:r>
+        <w:rPr>
+          <w:rFonts w:ascii="Calibri" w:hAnsi="Calibri"/>
+          <w:sz w:val="22"/>
+        </w:rPr>
+        <w:t>La importación JSON reemplaza todos los datos actuales por los del archivo.</w:t>
+      </w:r>
+    </w:p>
+    <w:p>
+      <w:r>
+        <w:rPr>
+          <w:rFonts w:ascii="Calibri" w:hAnsi="Calibri"/>
+          <w:sz w:val="22"/>
+        </w:rPr>
+        <w:t>Los backups anteriores a las bolsas anuales siguen siendo compatibles. Al importarlos, sus cuatro bolsas de teletrabajo se asignan a 2026; las de otros años deberán configurarse si no figuran en la copia.</w:t>
+      </w:r>
+    </w:p>
+    <w:p>
+      <w:pPr>
+        <w:pStyle w:val="Heading1"/>
+      </w:pPr>
+      <w:r>
+        <w:t>13. Exportación e importación mensual</w:t>
+      </w:r>
+    </w:p>
+    <w:p>
+      <w:pPr>
+        <w:pStyle w:val="Heading2"/>
+      </w:pPr>
+      <w:r>
+        <w:t>13.1 Exportar CSV del mes</w:t>
       </w:r>
     </w:p>
     <w:p>
       <w:pPr>
         <w:numPr>
           <w:ilvl w:val="0"/>
-          <w:numId w:val="21"/>
+          <w:numId w:val="22"/>
+        </w:numPr>
+      </w:pPr>
+      <w:r>
+        <w:rPr>
+          <w:rFonts w:ascii="Calibri" w:hAnsi="Calibri"/>
+          <w:sz w:val="22"/>
+        </w:rPr>
+        <w:t>Seleccionar el mes.</w:t>
+      </w:r>
+    </w:p>
+    <w:p>
+      <w:pPr>
+        <w:numPr>
+          <w:ilvl w:val="0"/>
+          <w:numId w:val="22"/>
         </w:numPr>
       </w:pPr>
       <w:r>
@@ -4636,7 +5238,7 @@
       <w:pPr>
         <w:numPr>
           <w:ilvl w:val="0"/>
-          <w:numId w:val="21"/>
+          <w:numId w:val="22"/>
         </w:numPr>
       </w:pPr>
       <w:r>
@@ -4693,7 +5295,7 @@
       <w:pPr>
         <w:numPr>
           <w:ilvl w:val="0"/>
-          <w:numId w:val="22"/>
+          <w:numId w:val="23"/>
         </w:numPr>
       </w:pPr>
       <w:r>
@@ -4724,7 +5326,7 @@
       <w:pPr>
         <w:numPr>
           <w:ilvl w:val="0"/>
-          <w:numId w:val="22"/>
+          <w:numId w:val="23"/>
         </w:numPr>
       </w:pPr>
       <w:r>
@@ -4755,7 +5357,7 @@
       <w:pPr>
         <w:numPr>
           <w:ilvl w:val="0"/>
-          <w:numId w:val="22"/>
+          <w:numId w:val="23"/>
         </w:numPr>
       </w:pPr>
       <w:r>
@@ -4770,7 +5372,7 @@
       <w:pPr>
         <w:numPr>
           <w:ilvl w:val="0"/>
-          <w:numId w:val="22"/>
+          <w:numId w:val="23"/>
         </w:numPr>
       </w:pPr>
       <w:r>
@@ -5009,7 +5611,58 @@
         <w:pStyle w:val="Heading2"/>
       </w:pPr>
       <w:r>
-        <w:t>14.3 Recomendación de backup</w:t>
+        <w:t>14.3 Actualización al volver a la aplicación</w:t>
+      </w:r>
+    </w:p>
+    <w:p>
+      <w:r>
+        <w:rPr>
+          <w:rFonts w:ascii="Calibri" w:hAnsi="Calibri"/>
+          <w:sz w:val="22"/>
+        </w:rPr>
+        <w:t>Al volver a una pestaña visible o recuperar el foco de la aplicación, se recargan los datos de la cuenta si hay sesión y conexión. Se mantiene seleccionado el mismo mes si sigue disponible.</w:t>
+      </w:r>
+    </w:p>
+    <w:p>
+      <w:r>
+        <w:rPr>
+          <w:rFonts w:ascii="Calibri" w:hAnsi="Calibri"/>
+          <w:sz w:val="22"/>
+        </w:rPr>
+        <w:t>La recarga se aplaza mientras hay un formulario abierto u operaciones de guardado en curso. Si existen cambios locales en cola, primero se intenta sincronizarlos; solo se cargan los datos remotos cuando ya no quedan cambios pendientes. Si ese intento falla, se conserva la copia local.</w:t>
+      </w:r>
+    </w:p>
+    <w:p>
+      <w:r>
+        <w:rPr>
+          <w:rFonts w:ascii="Calibri" w:hAnsi="Calibri"/>
+          <w:sz w:val="22"/>
+        </w:rPr>
+        <w:t xml:space="preserve">Para revisar cambios hechos desde otro dispositivo, esperar a que ese dispositivo muestre </w:t>
+      </w:r>
+      <w:r>
+        <w:rPr>
+          <w:rFonts w:ascii="Consolas" w:hAnsi="Consolas"/>
+          <w:color w:val="0B2545"/>
+          <w:sz w:val="19"/>
+          <w:shd w:fill="E8EEF5"/>
+        </w:rPr>
+        <w:t>Sincronizado</w:t>
+      </w:r>
+      <w:r>
+        <w:rPr>
+          <w:rFonts w:ascii="Calibri" w:hAnsi="Calibri"/>
+          <w:sz w:val="22"/>
+        </w:rPr>
+        <w:t xml:space="preserve"> y volver a la aplicación en el dispositivo de consulta.</w:t>
+      </w:r>
+    </w:p>
+    <w:p>
+      <w:pPr>
+        <w:pStyle w:val="Heading2"/>
+      </w:pPr>
+      <w:r>
+        <w:t>14.4 Recomendación de backup</w:t>
       </w:r>
     </w:p>
     <w:p>
@@ -5116,7 +5769,7 @@
       <w:pPr>
         <w:numPr>
           <w:ilvl w:val="0"/>
-          <w:numId w:val="23"/>
+          <w:numId w:val="24"/>
         </w:numPr>
       </w:pPr>
       <w:r>
@@ -5131,7 +5784,7 @@
       <w:pPr>
         <w:numPr>
           <w:ilvl w:val="0"/>
-          <w:numId w:val="23"/>
+          <w:numId w:val="24"/>
         </w:numPr>
       </w:pPr>
       <w:r>
@@ -5146,7 +5799,7 @@
       <w:pPr>
         <w:numPr>
           <w:ilvl w:val="0"/>
-          <w:numId w:val="23"/>
+          <w:numId w:val="24"/>
         </w:numPr>
       </w:pPr>
       <w:r>
@@ -5194,7 +5847,7 @@
       <w:pPr>
         <w:numPr>
           <w:ilvl w:val="0"/>
-          <w:numId w:val="24"/>
+          <w:numId w:val="25"/>
         </w:numPr>
       </w:pPr>
       <w:r>
@@ -5209,7 +5862,7 @@
       <w:pPr>
         <w:numPr>
           <w:ilvl w:val="0"/>
-          <w:numId w:val="24"/>
+          <w:numId w:val="25"/>
         </w:numPr>
       </w:pPr>
       <w:r>
@@ -5224,7 +5877,7 @@
       <w:pPr>
         <w:numPr>
           <w:ilvl w:val="0"/>
-          <w:numId w:val="24"/>
+          <w:numId w:val="25"/>
         </w:numPr>
       </w:pPr>
       <w:r>
@@ -5263,7 +5916,7 @@
       <w:pPr>
         <w:numPr>
           <w:ilvl w:val="0"/>
-          <w:numId w:val="25"/>
+          <w:numId w:val="26"/>
         </w:numPr>
       </w:pPr>
       <w:r>
@@ -5278,7 +5931,7 @@
       <w:pPr>
         <w:numPr>
           <w:ilvl w:val="0"/>
-          <w:numId w:val="25"/>
+          <w:numId w:val="26"/>
         </w:numPr>
       </w:pPr>
       <w:r>
@@ -5293,7 +5946,7 @@
       <w:pPr>
         <w:numPr>
           <w:ilvl w:val="0"/>
-          <w:numId w:val="25"/>
+          <w:numId w:val="26"/>
         </w:numPr>
       </w:pPr>
       <w:r>
@@ -6271,7 +6924,7 @@
       <w:pPr>
         <w:numPr>
           <w:ilvl w:val="0"/>
-          <w:numId w:val="26"/>
+          <w:numId w:val="27"/>
         </w:numPr>
       </w:pPr>
       <w:r>
@@ -6286,7 +6939,7 @@
       <w:pPr>
         <w:numPr>
           <w:ilvl w:val="0"/>
-          <w:numId w:val="26"/>
+          <w:numId w:val="27"/>
         </w:numPr>
       </w:pPr>
       <w:r>
@@ -6301,7 +6954,7 @@
       <w:pPr>
         <w:numPr>
           <w:ilvl w:val="0"/>
-          <w:numId w:val="26"/>
+          <w:numId w:val="27"/>
         </w:numPr>
       </w:pPr>
       <w:r>
@@ -6332,7 +6985,7 @@
       <w:pPr>
         <w:numPr>
           <w:ilvl w:val="0"/>
-          <w:numId w:val="26"/>
+          <w:numId w:val="27"/>
         </w:numPr>
       </w:pPr>
       <w:r>
@@ -6427,6 +7080,181 @@
     </w:p>
     <w:p>
       <w:pPr>
+        <w:pStyle w:val="Heading2"/>
+      </w:pPr>
+      <w:r>
+        <w:t>19.10 Las bolsas de teletrabajo aparecen a cero al cambiar de año</w:t>
+      </w:r>
+    </w:p>
+    <w:p>
+      <w:r>
+        <w:rPr>
+          <w:rFonts w:ascii="Calibri" w:hAnsi="Calibri"/>
+          <w:sz w:val="22"/>
+        </w:rPr>
+        <w:t xml:space="preserve">Comprobar </w:t>
+      </w:r>
+      <w:r>
+        <w:rPr>
+          <w:rFonts w:ascii="Consolas" w:hAnsi="Consolas"/>
+          <w:color w:val="0B2545"/>
+          <w:sz w:val="19"/>
+          <w:shd w:fill="E8EEF5"/>
+        </w:rPr>
+        <w:t>Año de las bolsas trimestrales</w:t>
+      </w:r>
+      <w:r>
+        <w:rPr>
+          <w:rFonts w:ascii="Calibri" w:hAnsi="Calibri"/>
+          <w:sz w:val="22"/>
+        </w:rPr>
+        <w:t xml:space="preserve">. Cada año tiene su propia configuración y los años nuevos empiezan en </w:t>
+      </w:r>
+      <w:r>
+        <w:rPr>
+          <w:rFonts w:ascii="Consolas" w:hAnsi="Consolas"/>
+          <w:color w:val="0B2545"/>
+          <w:sz w:val="19"/>
+          <w:shd w:fill="E8EEF5"/>
+        </w:rPr>
+        <w:t>00:00</w:t>
+      </w:r>
+      <w:r>
+        <w:rPr>
+          <w:rFonts w:ascii="Calibri" w:hAnsi="Calibri"/>
+          <w:sz w:val="22"/>
+        </w:rPr>
+        <w:t>. Introducir las bolsas del año que corresponda. Las bolsas anteriores a esta función se conservan en 2026.</w:t>
+      </w:r>
+    </w:p>
+    <w:p>
+      <w:r>
+        <w:rPr>
+          <w:rFonts w:ascii="Calibri" w:hAnsi="Calibri"/>
+          <w:sz w:val="22"/>
+        </w:rPr>
+        <w:t>Si las bolsas se guardan localmente pero persiste un error al sincronizar, exportar un JSON y solicitar al responsable de la aplicación que compruebe que la base de datos admite la configuración anual de teletrabajo. Reintentar la sincronización cuando se haya corregido.</w:t>
+      </w:r>
+    </w:p>
+    <w:p>
+      <w:pPr>
+        <w:pStyle w:val="Heading2"/>
+      </w:pPr>
+      <w:r>
+        <w:t>19.11 No veo los cambios de otro dispositivo</w:t>
+      </w:r>
+    </w:p>
+    <w:p>
+      <w:pPr>
+        <w:numPr>
+          <w:ilvl w:val="0"/>
+          <w:numId w:val="28"/>
+        </w:numPr>
+      </w:pPr>
+      <w:r>
+        <w:rPr>
+          <w:rFonts w:ascii="Calibri" w:hAnsi="Calibri"/>
+          <w:sz w:val="22"/>
+        </w:rPr>
+        <w:t>Comprobar que ambos dispositivos utilizan la misma cuenta y tienen conexión.</w:t>
+      </w:r>
+    </w:p>
+    <w:p>
+      <w:pPr>
+        <w:numPr>
+          <w:ilvl w:val="0"/>
+          <w:numId w:val="28"/>
+        </w:numPr>
+      </w:pPr>
+      <w:r>
+        <w:rPr>
+          <w:rFonts w:ascii="Calibri" w:hAnsi="Calibri"/>
+          <w:sz w:val="22"/>
+        </w:rPr>
+        <w:t xml:space="preserve">Esperar a que el dispositivo donde se editó muestre </w:t>
+      </w:r>
+      <w:r>
+        <w:rPr>
+          <w:rFonts w:ascii="Consolas" w:hAnsi="Consolas"/>
+          <w:color w:val="0B2545"/>
+          <w:sz w:val="19"/>
+          <w:shd w:fill="E8EEF5"/>
+        </w:rPr>
+        <w:t>Sincronizado</w:t>
+      </w:r>
+      <w:r>
+        <w:rPr>
+          <w:rFonts w:ascii="Calibri" w:hAnsi="Calibri"/>
+          <w:sz w:val="22"/>
+        </w:rPr>
+        <w:t>.</w:t>
+      </w:r>
+    </w:p>
+    <w:p>
+      <w:pPr>
+        <w:numPr>
+          <w:ilvl w:val="0"/>
+          <w:numId w:val="28"/>
+        </w:numPr>
+      </w:pPr>
+      <w:r>
+        <w:rPr>
+          <w:rFonts w:ascii="Calibri" w:hAnsi="Calibri"/>
+          <w:sz w:val="22"/>
+        </w:rPr>
+        <w:t>Cerrar los formularios abiertos en el dispositivo de consulta y volver a su pestaña o ventana.</w:t>
+      </w:r>
+    </w:p>
+    <w:p>
+      <w:pPr>
+        <w:numPr>
+          <w:ilvl w:val="0"/>
+          <w:numId w:val="28"/>
+        </w:numPr>
+      </w:pPr>
+      <w:r>
+        <w:rPr>
+          <w:rFonts w:ascii="Calibri" w:hAnsi="Calibri"/>
+          <w:sz w:val="22"/>
+        </w:rPr>
+        <w:t>Si hay cambios locales pendientes, sincronizarlos antes de esperar la recarga remota.</w:t>
+      </w:r>
+    </w:p>
+    <w:p>
+      <w:pPr>
+        <w:pStyle w:val="Heading2"/>
+      </w:pPr>
+      <w:r>
+        <w:t>19.12 La recomendación del viernes es distinta de mi salida guardada</w:t>
+      </w:r>
+    </w:p>
+    <w:p>
+      <w:r>
+        <w:rPr>
+          <w:rFonts w:ascii="Calibri" w:hAnsi="Calibri"/>
+          <w:sz w:val="22"/>
+        </w:rPr>
+        <w:t xml:space="preserve">La salida guardada se mantiene y es la que se utiliza en los cálculos. </w:t>
+      </w:r>
+      <w:r>
+        <w:rPr>
+          <w:rFonts w:ascii="Consolas" w:hAnsi="Consolas"/>
+          <w:color w:val="0B2545"/>
+          <w:sz w:val="19"/>
+          <w:shd w:fill="E8EEF5"/>
+        </w:rPr>
+        <w:t>Recomendada</w:t>
+      </w:r>
+      <w:r>
+        <w:rPr>
+          <w:rFonts w:ascii="Calibri" w:hAnsi="Calibri"/>
+          <w:sz w:val="22"/>
+        </w:rPr>
+        <w:t xml:space="preserve"> es una orientación calculada con la bolsa positiva disponible. Si se quiere registrar otra hora de salida, editar el fichaje y guardarla.</w:t>
+      </w:r>
+    </w:p>
+    <w:p>
+      <w:pPr>
         <w:pStyle w:val="Heading1"/>
       </w:pPr>
       <w:r>
@@ -6521,7 +7349,7 @@
           <w:rFonts w:ascii="Calibri" w:hAnsi="Calibri"/>
           <w:sz w:val="22"/>
         </w:rPr>
-        <w:t>Pendiente: fichaje pasado o iniciado que carece de datos obligatorios o tiene una secuencia horaria incoherente.</w:t>
+        <w:t>Jornada partida: jornada computable con inicio y fin de comida registrados.</w:t>
       </w:r>
     </w:p>
     <w:p>
@@ -6536,7 +7364,52 @@
           <w:rFonts w:ascii="Calibri" w:hAnsi="Calibri"/>
           <w:sz w:val="22"/>
         </w:rPr>
+        <w:t>Jornada única: jornada computable sin un tramo completo de comida; su tiempo se asigna a mañana en las estadísticas.</w:t>
+      </w:r>
+    </w:p>
+    <w:p>
+      <w:pPr>
+        <w:numPr>
+          <w:ilvl w:val="0"/>
+          <w:numId w:val="10"/>
+        </w:numPr>
+      </w:pPr>
+      <w:r>
+        <w:rPr>
+          <w:rFonts w:ascii="Calibri" w:hAnsi="Calibri"/>
+          <w:sz w:val="22"/>
+        </w:rPr>
+        <w:t>Pendiente: fichaje pasado o iniciado que carece de datos obligatorios o tiene una secuencia horaria incoherente.</w:t>
+      </w:r>
+    </w:p>
+    <w:p>
+      <w:pPr>
+        <w:numPr>
+          <w:ilvl w:val="0"/>
+          <w:numId w:val="10"/>
+        </w:numPr>
+      </w:pPr>
+      <w:r>
+        <w:rPr>
+          <w:rFonts w:ascii="Calibri" w:hAnsi="Calibri"/>
+          <w:sz w:val="22"/>
+        </w:rPr>
         <w:t>Sincronización: copia de los cambios locales en la cuenta remota.</w:t>
+      </w:r>
+    </w:p>
+    <w:p>
+      <w:pPr>
+        <w:numPr>
+          <w:ilvl w:val="0"/>
+          <w:numId w:val="10"/>
+        </w:numPr>
+      </w:pPr>
+      <w:r>
+        <w:rPr>
+          <w:rFonts w:ascii="Calibri" w:hAnsi="Calibri"/>
+          <w:sz w:val="22"/>
+        </w:rPr>
+        <w:t>Salida recomendada: propuesta de salida del viernes calculada con la bolsa positiva disponible y la hora mínima de salida.</w:t>
       </w:r>
     </w:p>
     <w:p>
@@ -7045,6 +7918,41 @@
       <w:rPr>
         <w:rFonts w:ascii="Symbol" w:hAnsi="Symbol" w:hint="default"/>
       </w:rPr>
+    </w:lvl>
+  </w:abstractNum>
+  <w:abstractNum w:abstractNumId="9">
+    <w:multiLevelType w:val="singleLevel"/>
+    <w:lvl w:ilvl="0">
+      <w:start w:val="1"/>
+      <w:numFmt w:val="bullet"/>
+      <w:lvlText w:val="•"/>
+      <w:lvlJc w:val="left"/>
+      <w:pPr>
+        <w:tabs>
+          <w:tab w:val="num" w:pos="540"/>
+        </w:tabs>
+        <w:spacing w:after="80" w:line="300" w:lineRule="auto"/>
+        <w:ind w:left="540" w:hanging="270"/>
+      </w:pPr>
+      <w:rPr>
+        <w:rFonts w:ascii="Calibri" w:hAnsi="Calibri"/>
+      </w:rPr>
+    </w:lvl>
+  </w:abstractNum>
+  <w:abstractNum w:abstractNumId="10">
+    <w:multiLevelType w:val="singleLevel"/>
+    <w:lvl w:ilvl="0">
+      <w:start w:val="1"/>
+      <w:numFmt w:val="decimal"/>
+      <w:lvlText w:val="%1."/>
+      <w:lvlJc w:val="left"/>
+      <w:pPr>
+        <w:tabs>
+          <w:tab w:val="num" w:pos="540"/>
+        </w:tabs>
+        <w:spacing w:after="80" w:line="300" w:lineRule="auto"/>
+        <w:ind w:left="540" w:hanging="270"/>
+      </w:pPr>
     </w:lvl>
   </w:abstractNum>
   <w:num w:numId="1">
@@ -7074,44 +7982,9 @@
   <w:num w:numId="9">
     <w:abstractNumId w:val="0"/>
   </w:num>
-  <w:abstractNum w:abstractNumId="9">
-    <w:multiLevelType w:val="singleLevel"/>
-    <w:lvl w:ilvl="0">
-      <w:start w:val="1"/>
-      <w:numFmt w:val="bullet"/>
-      <w:lvlText w:val="•"/>
-      <w:lvlJc w:val="left"/>
-      <w:pPr>
-        <w:tabs>
-          <w:tab w:val="num" w:pos="540"/>
-        </w:tabs>
-        <w:ind w:left="540" w:hanging="270"/>
-        <w:spacing w:after="80" w:line="300" w:lineRule="auto"/>
-      </w:pPr>
-      <w:rPr>
-        <w:rFonts w:ascii="Calibri" w:hAnsi="Calibri"/>
-      </w:rPr>
-    </w:lvl>
-  </w:abstractNum>
   <w:num w:numId="10">
     <w:abstractNumId w:val="9"/>
   </w:num>
-  <w:abstractNum w:abstractNumId="10">
-    <w:multiLevelType w:val="singleLevel"/>
-    <w:lvl w:ilvl="0">
-      <w:start w:val="1"/>
-      <w:numFmt w:val="decimal"/>
-      <w:lvlText w:val="%1."/>
-      <w:lvlJc w:val="left"/>
-      <w:pPr>
-        <w:tabs>
-          <w:tab w:val="num" w:pos="540"/>
-        </w:tabs>
-        <w:ind w:left="540" w:hanging="270"/>
-        <w:spacing w:after="80" w:line="300" w:lineRule="auto"/>
-      </w:pPr>
-    </w:lvl>
-  </w:abstractNum>
   <w:num w:numId="11">
     <w:abstractNumId w:val="10"/>
   </w:num>
@@ -7200,6 +8073,18 @@
     </w:lvlOverride>
   </w:num>
   <w:num w:numId="26">
+    <w:abstractNumId w:val="10"/>
+    <w:lvlOverride w:ilvl="0">
+      <w:startOverride w:val="1"/>
+    </w:lvlOverride>
+  </w:num>
+  <w:num w:numId="27">
+    <w:abstractNumId w:val="10"/>
+    <w:lvlOverride w:ilvl="0">
+      <w:startOverride w:val="1"/>
+    </w:lvlOverride>
+  </w:num>
+  <w:num w:numId="28">
     <w:abstractNumId w:val="10"/>
     <w:lvlOverride w:ilvl="0">
       <w:startOverride w:val="1"/>

</xml_diff>

<commit_message>
feat(config): annualize workday settings
</commit_message>
<xml_diff>
--- a/Manual_de_usuario_Fichajes.docx
+++ b/Manual_de_usuario_Fichajes.docx
@@ -64,7 +64,7 @@
           <w:color w:val="5A626E"/>
           <w:sz w:val="22"/>
         </w:rPr>
-        <w:t>Versión de la aplicación 2.19.1</w:t>
+        <w:t>Versión de la aplicación 2.20.0</w:t>
       </w:r>
     </w:p>
     <w:p>
@@ -2964,7 +2964,134 @@
           <w:rFonts w:ascii="Calibri" w:hAnsi="Calibri"/>
           <w:sz w:val="22"/>
         </w:rPr>
-        <w:t xml:space="preserve"> controla las reglas de cálculo.</w:t>
+        <w:t xml:space="preserve"> controla las reglas de cálculo de cada año. Para ajustar una jornada:</w:t>
+      </w:r>
+    </w:p>
+    <w:p>
+      <w:pPr>
+        <w:numPr>
+          <w:ilvl w:val="0"/>
+          <w:numId w:val="19"/>
+        </w:numPr>
+      </w:pPr>
+      <w:r>
+        <w:rPr>
+          <w:rFonts w:ascii="Calibri" w:hAnsi="Calibri"/>
+          <w:sz w:val="22"/>
+        </w:rPr>
+        <w:t xml:space="preserve">Elegir el </w:t>
+      </w:r>
+      <w:r>
+        <w:rPr>
+          <w:rFonts w:ascii="Consolas" w:hAnsi="Consolas"/>
+          <w:color w:val="0B2545"/>
+          <w:sz w:val="19"/>
+          <w:shd w:fill="E8EEF5"/>
+        </w:rPr>
+        <w:t>Año de la jornada</w:t>
+      </w:r>
+      <w:r>
+        <w:rPr>
+          <w:rFonts w:ascii="Calibri" w:hAnsi="Calibri"/>
+          <w:sz w:val="22"/>
+        </w:rPr>
+        <w:t>, entre 2020 y 2099.</w:t>
+      </w:r>
+    </w:p>
+    <w:p>
+      <w:pPr>
+        <w:numPr>
+          <w:ilvl w:val="0"/>
+          <w:numId w:val="19"/>
+        </w:numPr>
+      </w:pPr>
+      <w:r>
+        <w:rPr>
+          <w:rFonts w:ascii="Calibri" w:hAnsi="Calibri"/>
+          <w:sz w:val="22"/>
+        </w:rPr>
+        <w:t>Modificar las horas por día, las fechas de intensiva o las reglas horarias que correspondan a ese año.</w:t>
+      </w:r>
+    </w:p>
+    <w:p>
+      <w:pPr>
+        <w:numPr>
+          <w:ilvl w:val="0"/>
+          <w:numId w:val="19"/>
+        </w:numPr>
+      </w:pPr>
+      <w:r>
+        <w:rPr>
+          <w:rFonts w:ascii="Calibri" w:hAnsi="Calibri"/>
+          <w:sz w:val="22"/>
+        </w:rPr>
+        <w:t>Salir del campo para guardar y comprobar el estado de sincronización.</w:t>
+      </w:r>
+    </w:p>
+    <w:p>
+      <w:r>
+        <w:rPr>
+          <w:rFonts w:ascii="Calibri" w:hAnsi="Calibri"/>
+          <w:sz w:val="22"/>
+        </w:rPr>
+        <w:t xml:space="preserve">Se puede configurar un año antes de crear sus meses. Al cambiar de mes, el panel muestra el año de ese mes. Cambiar solo </w:t>
+      </w:r>
+      <w:r>
+        <w:rPr>
+          <w:rFonts w:ascii="Consolas" w:hAnsi="Consolas"/>
+          <w:color w:val="0B2545"/>
+          <w:sz w:val="19"/>
+          <w:shd w:fill="E8EEF5"/>
+        </w:rPr>
+        <w:t>Año de la jornada</w:t>
+      </w:r>
+      <w:r>
+        <w:rPr>
+          <w:rFonts w:ascii="Calibri" w:hAnsi="Calibri"/>
+          <w:sz w:val="22"/>
+        </w:rPr>
+        <w:t xml:space="preserve"> permite preparar otro año sin cambiar el mes seleccionado.</w:t>
+      </w:r>
+    </w:p>
+    <w:p>
+      <w:r>
+        <w:rPr>
+          <w:rFonts w:ascii="Calibri" w:hAnsi="Calibri"/>
+          <w:sz w:val="22"/>
+        </w:rPr>
+        <w:t xml:space="preserve">La configuración que existía antes de esta función se conserva como base para los años sin configurar. Al editar un año, sus ajustes quedan guardados por separado. Por ejemplo, cambiar la jornada de 2027 de </w:t>
+      </w:r>
+      <w:r>
+        <w:rPr>
+          <w:rFonts w:ascii="Consolas" w:hAnsi="Consolas"/>
+          <w:color w:val="0B2545"/>
+          <w:sz w:val="19"/>
+          <w:shd w:fill="E8EEF5"/>
+        </w:rPr>
+        <w:t>07:43</w:t>
+      </w:r>
+      <w:r>
+        <w:rPr>
+          <w:rFonts w:ascii="Calibri" w:hAnsi="Calibri"/>
+          <w:sz w:val="22"/>
+        </w:rPr>
+        <w:t xml:space="preserve"> a </w:t>
+      </w:r>
+      <w:r>
+        <w:rPr>
+          <w:rFonts w:ascii="Consolas" w:hAnsi="Consolas"/>
+          <w:color w:val="0B2545"/>
+          <w:sz w:val="19"/>
+          <w:shd w:fill="E8EEF5"/>
+        </w:rPr>
+        <w:t>07:30</w:t>
+      </w:r>
+      <w:r>
+        <w:rPr>
+          <w:rFonts w:ascii="Calibri" w:hAnsi="Calibri"/>
+          <w:sz w:val="22"/>
+        </w:rPr>
+        <w:t xml:space="preserve"> no modifica los cálculos de 2026 ni los ajustes de otros años.</w:t>
       </w:r>
     </w:p>
     <w:p>
@@ -3117,7 +3244,7 @@
           <w:rFonts w:ascii="Calibri" w:hAnsi="Calibri"/>
           <w:sz w:val="22"/>
         </w:rPr>
-        <w:t>Los días comprendidos entre ambas fechas usan la jornada de verano.</w:t>
+        <w:t>Los días comprendidos entre ambas fechas usan la jornada de verano del año del fichaje. Las fechas deben ser válidas para el año elegido y el inicio no puede ser posterior al fin. Un valor inválido se marca en rojo y no sustituye el último ajuste válido.</w:t>
       </w:r>
     </w:p>
     <w:p>
@@ -3240,14 +3367,14 @@
           <w:sz w:val="19"/>
           <w:shd w:fill="E8EEF5"/>
         </w:rPr>
-        <w:t>Bolsa inicio de año</w:t>
-      </w:r>
-      <w:r>
-        <w:rPr>
-          <w:rFonts w:ascii="Calibri" w:hAnsi="Calibri"/>
-          <w:sz w:val="22"/>
-        </w:rPr>
-        <w:t xml:space="preserve"> define el saldo inicial de la bolsa de horas. El valor máximo admitido es </w:t>
+        <w:t>Bolsa inicial del histórico</w:t>
+      </w:r>
+      <w:r>
+        <w:rPr>
+          <w:rFonts w:ascii="Calibri" w:hAnsi="Calibri"/>
+          <w:sz w:val="22"/>
+        </w:rPr>
+        <w:t xml:space="preserve"> define el saldo inicial de la bolsa de horas al comienzo de los meses registrados. El valor máximo admitido es </w:t>
       </w:r>
       <w:r>
         <w:rPr>
@@ -3267,6 +3394,15 @@
       </w:r>
     </w:p>
     <w:p>
+      <w:r>
+        <w:rPr>
+          <w:rFonts w:ascii="Calibri" w:hAnsi="Calibri"/>
+          <w:sz w:val="22"/>
+        </w:rPr>
+        <w:t>Este valor es global y no pertenece al año elegido en el panel. La bolsa se conserva al pasar de diciembre a enero; no se reinicia ni se aplica de nuevo el saldo inicial por cambiar de año natural. Modificar este campo recalcula el saldo de todo el histórico.</w:t>
+      </w:r>
+    </w:p>
+    <w:p>
       <w:pPr>
         <w:pStyle w:val="Heading1"/>
       </w:pPr>
@@ -3463,6 +3599,15 @@
           <w:rFonts w:ascii="Calibri" w:hAnsi="Calibri"/>
           <w:sz w:val="22"/>
         </w:rPr>
+        <w:t>El saldo continúa entre años naturales, tanto si es positivo como negativo. Cada día se calcula con la configuración de jornada de su propio año, aunque el saldo provenga del anterior.</w:t>
+      </w:r>
+    </w:p>
+    <w:p>
+      <w:r>
+        <w:rPr>
+          <w:rFonts w:ascii="Calibri" w:hAnsi="Calibri"/>
+          <w:sz w:val="22"/>
+        </w:rPr>
         <w:t>La aplicación aplica estas reglas de bolsa:</w:t>
       </w:r>
     </w:p>
@@ -3817,7 +3962,7 @@
       <w:pPr>
         <w:numPr>
           <w:ilvl w:val="0"/>
-          <w:numId w:val="19"/>
+          <w:numId w:val="20"/>
         </w:numPr>
       </w:pPr>
       <w:r>
@@ -3848,7 +3993,7 @@
       <w:pPr>
         <w:numPr>
           <w:ilvl w:val="0"/>
-          <w:numId w:val="19"/>
+          <w:numId w:val="20"/>
         </w:numPr>
       </w:pPr>
       <w:r>
@@ -3879,7 +4024,7 @@
       <w:pPr>
         <w:numPr>
           <w:ilvl w:val="0"/>
-          <w:numId w:val="19"/>
+          <w:numId w:val="20"/>
         </w:numPr>
       </w:pPr>
       <w:r>
@@ -3894,7 +4039,7 @@
       <w:pPr>
         <w:numPr>
           <w:ilvl w:val="0"/>
-          <w:numId w:val="19"/>
+          <w:numId w:val="20"/>
         </w:numPr>
       </w:pPr>
       <w:r>
@@ -4888,7 +5033,7 @@
       <w:pPr>
         <w:numPr>
           <w:ilvl w:val="0"/>
-          <w:numId w:val="20"/>
+          <w:numId w:val="21"/>
         </w:numPr>
       </w:pPr>
       <w:r>
@@ -4919,7 +5064,7 @@
       <w:pPr>
         <w:numPr>
           <w:ilvl w:val="0"/>
-          <w:numId w:val="20"/>
+          <w:numId w:val="21"/>
         </w:numPr>
       </w:pPr>
       <w:r>
@@ -4967,7 +5112,7 @@
           <w:rFonts w:ascii="Calibri" w:hAnsi="Calibri"/>
           <w:sz w:val="22"/>
         </w:rPr>
-        <w:t>Configuración, incluidos los calendarios personalizados de festivos y las bolsas de teletrabajo de todos los años.</w:t>
+        <w:t>Configuración, incluidos los ajustes de jornada, los calendarios personalizados de festivos y las bolsas de teletrabajo de todos los años.</w:t>
       </w:r>
     </w:p>
     <w:p>
@@ -5066,7 +5211,7 @@
       <w:pPr>
         <w:numPr>
           <w:ilvl w:val="0"/>
-          <w:numId w:val="21"/>
+          <w:numId w:val="22"/>
         </w:numPr>
       </w:pPr>
       <w:r>
@@ -5097,7 +5242,7 @@
       <w:pPr>
         <w:numPr>
           <w:ilvl w:val="0"/>
-          <w:numId w:val="21"/>
+          <w:numId w:val="22"/>
         </w:numPr>
       </w:pPr>
       <w:r>
@@ -5128,7 +5273,7 @@
       <w:pPr>
         <w:numPr>
           <w:ilvl w:val="0"/>
-          <w:numId w:val="21"/>
+          <w:numId w:val="22"/>
         </w:numPr>
       </w:pPr>
       <w:r>
@@ -5137,55 +5282,6 @@
           <w:sz w:val="22"/>
         </w:rPr>
         <w:t>Seleccionar o arrastrar el archivo.</w:t>
-      </w:r>
-    </w:p>
-    <w:p>
-      <w:pPr>
-        <w:numPr>
-          <w:ilvl w:val="0"/>
-          <w:numId w:val="21"/>
-        </w:numPr>
-      </w:pPr>
-      <w:r>
-        <w:rPr>
-          <w:rFonts w:ascii="Calibri" w:hAnsi="Calibri"/>
-          <w:sz w:val="22"/>
-        </w:rPr>
-        <w:t>Confirmar la sustitución de datos.</w:t>
-      </w:r>
-    </w:p>
-    <w:p>
-      <w:r>
-        <w:rPr>
-          <w:rFonts w:ascii="Calibri" w:hAnsi="Calibri"/>
-          <w:sz w:val="22"/>
-        </w:rPr>
-        <w:t>La importación JSON reemplaza todos los datos actuales por los del archivo.</w:t>
-      </w:r>
-    </w:p>
-    <w:p>
-      <w:r>
-        <w:rPr>
-          <w:rFonts w:ascii="Calibri" w:hAnsi="Calibri"/>
-          <w:sz w:val="22"/>
-        </w:rPr>
-        <w:t>Los backups anteriores a las bolsas anuales siguen siendo compatibles. Al importarlos, sus cuatro bolsas de teletrabajo se asignan a 2026; las de otros años deberán configurarse si no figuran en la copia.</w:t>
-      </w:r>
-    </w:p>
-    <w:p>
-      <w:pPr>
-        <w:pStyle w:val="Heading1"/>
-      </w:pPr>
-      <w:r>
-        <w:t>13. Exportación e importación mensual</w:t>
-      </w:r>
-    </w:p>
-    <w:p>
-      <w:pPr>
-        <w:pStyle w:val="Heading2"/>
-      </w:pPr>
-      <w:r>
-        <w:t>13.1 Exportar CSV del mes</w:t>
       </w:r>
     </w:p>
     <w:p>
@@ -5200,14 +5296,72 @@
           <w:rFonts w:ascii="Calibri" w:hAnsi="Calibri"/>
           <w:sz w:val="22"/>
         </w:rPr>
-        <w:t>Seleccionar el mes.</w:t>
+        <w:t>Confirmar la sustitución de datos.</w:t>
+      </w:r>
+    </w:p>
+    <w:p>
+      <w:r>
+        <w:rPr>
+          <w:rFonts w:ascii="Calibri" w:hAnsi="Calibri"/>
+          <w:sz w:val="22"/>
+        </w:rPr>
+        <w:t>La importación JSON reemplaza todos los datos actuales por los del archivo.</w:t>
+      </w:r>
+    </w:p>
+    <w:p>
+      <w:r>
+        <w:rPr>
+          <w:rFonts w:ascii="Calibri" w:hAnsi="Calibri"/>
+          <w:sz w:val="22"/>
+        </w:rPr>
+        <w:t>Los backups anteriores a las bolsas anuales siguen siendo compatibles. Al importarlos, sus cuatro bolsas de teletrabajo se asignan a 2026; las de otros años deberán configurarse si no figuran en la copia.</w:t>
+      </w:r>
+    </w:p>
+    <w:p>
+      <w:r>
+        <w:rPr>
+          <w:rFonts w:ascii="Calibri" w:hAnsi="Calibri"/>
+          <w:sz w:val="22"/>
+        </w:rPr>
+        <w:t>Los backups anteriores a la jornada anual también siguen siendo compatibles. Sus ajustes de jornada se utilizan como base para los años sin una configuración específica. La importación conserva los fichajes de la copia y no crea un reinicio de bolsa en enero.</w:t>
+      </w:r>
+    </w:p>
+    <w:p>
+      <w:pPr>
+        <w:pStyle w:val="Heading1"/>
+      </w:pPr>
+      <w:r>
+        <w:t>13. Exportación e importación mensual</w:t>
+      </w:r>
+    </w:p>
+    <w:p>
+      <w:pPr>
+        <w:pStyle w:val="Heading2"/>
+      </w:pPr>
+      <w:r>
+        <w:t>13.1 Exportar CSV del mes</w:t>
       </w:r>
     </w:p>
     <w:p>
       <w:pPr>
         <w:numPr>
           <w:ilvl w:val="0"/>
-          <w:numId w:val="22"/>
+          <w:numId w:val="23"/>
+        </w:numPr>
+      </w:pPr>
+      <w:r>
+        <w:rPr>
+          <w:rFonts w:ascii="Calibri" w:hAnsi="Calibri"/>
+          <w:sz w:val="22"/>
+        </w:rPr>
+        <w:t>Seleccionar el mes.</w:t>
+      </w:r>
+    </w:p>
+    <w:p>
+      <w:pPr>
+        <w:numPr>
+          <w:ilvl w:val="0"/>
+          <w:numId w:val="23"/>
         </w:numPr>
       </w:pPr>
       <w:r>
@@ -5238,7 +5392,7 @@
       <w:pPr>
         <w:numPr>
           <w:ilvl w:val="0"/>
-          <w:numId w:val="22"/>
+          <w:numId w:val="23"/>
         </w:numPr>
       </w:pPr>
       <w:r>
@@ -5295,7 +5449,7 @@
       <w:pPr>
         <w:numPr>
           <w:ilvl w:val="0"/>
-          <w:numId w:val="23"/>
+          <w:numId w:val="24"/>
         </w:numPr>
       </w:pPr>
       <w:r>
@@ -5326,7 +5480,7 @@
       <w:pPr>
         <w:numPr>
           <w:ilvl w:val="0"/>
-          <w:numId w:val="23"/>
+          <w:numId w:val="24"/>
         </w:numPr>
       </w:pPr>
       <w:r>
@@ -5357,7 +5511,7 @@
       <w:pPr>
         <w:numPr>
           <w:ilvl w:val="0"/>
-          <w:numId w:val="23"/>
+          <w:numId w:val="24"/>
         </w:numPr>
       </w:pPr>
       <w:r>
@@ -5372,7 +5526,7 @@
       <w:pPr>
         <w:numPr>
           <w:ilvl w:val="0"/>
-          <w:numId w:val="23"/>
+          <w:numId w:val="24"/>
         </w:numPr>
       </w:pPr>
       <w:r>
@@ -5769,7 +5923,7 @@
       <w:pPr>
         <w:numPr>
           <w:ilvl w:val="0"/>
-          <w:numId w:val="24"/>
+          <w:numId w:val="25"/>
         </w:numPr>
       </w:pPr>
       <w:r>
@@ -5784,7 +5938,7 @@
       <w:pPr>
         <w:numPr>
           <w:ilvl w:val="0"/>
-          <w:numId w:val="24"/>
+          <w:numId w:val="25"/>
         </w:numPr>
       </w:pPr>
       <w:r>
@@ -5799,7 +5953,7 @@
       <w:pPr>
         <w:numPr>
           <w:ilvl w:val="0"/>
-          <w:numId w:val="24"/>
+          <w:numId w:val="25"/>
         </w:numPr>
       </w:pPr>
       <w:r>
@@ -5847,7 +6001,7 @@
       <w:pPr>
         <w:numPr>
           <w:ilvl w:val="0"/>
-          <w:numId w:val="25"/>
+          <w:numId w:val="26"/>
         </w:numPr>
       </w:pPr>
       <w:r>
@@ -5862,7 +6016,7 @@
       <w:pPr>
         <w:numPr>
           <w:ilvl w:val="0"/>
-          <w:numId w:val="25"/>
+          <w:numId w:val="26"/>
         </w:numPr>
       </w:pPr>
       <w:r>
@@ -5877,7 +6031,7 @@
       <w:pPr>
         <w:numPr>
           <w:ilvl w:val="0"/>
-          <w:numId w:val="25"/>
+          <w:numId w:val="26"/>
         </w:numPr>
       </w:pPr>
       <w:r>
@@ -5916,7 +6070,7 @@
       <w:pPr>
         <w:numPr>
           <w:ilvl w:val="0"/>
-          <w:numId w:val="26"/>
+          <w:numId w:val="27"/>
         </w:numPr>
       </w:pPr>
       <w:r>
@@ -5931,7 +6085,7 @@
       <w:pPr>
         <w:numPr>
           <w:ilvl w:val="0"/>
-          <w:numId w:val="26"/>
+          <w:numId w:val="27"/>
         </w:numPr>
       </w:pPr>
       <w:r>
@@ -5946,7 +6100,7 @@
       <w:pPr>
         <w:numPr>
           <w:ilvl w:val="0"/>
-          <w:numId w:val="26"/>
+          <w:numId w:val="27"/>
         </w:numPr>
       </w:pPr>
       <w:r>
@@ -6924,7 +7078,7 @@
       <w:pPr>
         <w:numPr>
           <w:ilvl w:val="0"/>
-          <w:numId w:val="27"/>
+          <w:numId w:val="28"/>
         </w:numPr>
       </w:pPr>
       <w:r>
@@ -6939,7 +7093,7 @@
       <w:pPr>
         <w:numPr>
           <w:ilvl w:val="0"/>
-          <w:numId w:val="27"/>
+          <w:numId w:val="28"/>
         </w:numPr>
       </w:pPr>
       <w:r>
@@ -6954,7 +7108,7 @@
       <w:pPr>
         <w:numPr>
           <w:ilvl w:val="0"/>
-          <w:numId w:val="27"/>
+          <w:numId w:val="28"/>
         </w:numPr>
       </w:pPr>
       <w:r>
@@ -6985,7 +7139,7 @@
       <w:pPr>
         <w:numPr>
           <w:ilvl w:val="0"/>
-          <w:numId w:val="27"/>
+          <w:numId w:val="28"/>
         </w:numPr>
       </w:pPr>
       <w:r>
@@ -7148,7 +7302,7 @@
       <w:pPr>
         <w:numPr>
           <w:ilvl w:val="0"/>
-          <w:numId w:val="28"/>
+          <w:numId w:val="29"/>
         </w:numPr>
       </w:pPr>
       <w:r>
@@ -7163,7 +7317,7 @@
       <w:pPr>
         <w:numPr>
           <w:ilvl w:val="0"/>
-          <w:numId w:val="28"/>
+          <w:numId w:val="29"/>
         </w:numPr>
       </w:pPr>
       <w:r>
@@ -7194,7 +7348,7 @@
       <w:pPr>
         <w:numPr>
           <w:ilvl w:val="0"/>
-          <w:numId w:val="28"/>
+          <w:numId w:val="29"/>
         </w:numPr>
       </w:pPr>
       <w:r>
@@ -7209,7 +7363,7 @@
       <w:pPr>
         <w:numPr>
           <w:ilvl w:val="0"/>
-          <w:numId w:val="28"/>
+          <w:numId w:val="29"/>
         </w:numPr>
       </w:pPr>
       <w:r>
@@ -7251,6 +7405,80 @@
           <w:sz w:val="22"/>
         </w:rPr>
         <w:t xml:space="preserve"> es una orientación calculada con la bolsa positiva disponible. Si se quiere registrar otra hora de salida, editar el fichaje y guardarla.</w:t>
+      </w:r>
+    </w:p>
+    <w:p>
+      <w:pPr>
+        <w:pStyle w:val="Heading2"/>
+      </w:pPr>
+      <w:r>
+        <w:t>19.13 Quiero cambiar la jornada de un año sin modificar el anterior</w:t>
+      </w:r>
+    </w:p>
+    <w:p>
+      <w:r>
+        <w:rPr>
+          <w:rFonts w:ascii="Calibri" w:hAnsi="Calibri"/>
+          <w:sz w:val="22"/>
+        </w:rPr>
+        <w:t xml:space="preserve">Elegir </w:t>
+      </w:r>
+      <w:r>
+        <w:rPr>
+          <w:rFonts w:ascii="Consolas" w:hAnsi="Consolas"/>
+          <w:color w:val="0B2545"/>
+          <w:sz w:val="19"/>
+          <w:shd w:fill="E8EEF5"/>
+        </w:rPr>
+        <w:t>Año de la jornada</w:t>
+      </w:r>
+      <w:r>
+        <w:rPr>
+          <w:rFonts w:ascii="Calibri" w:hAnsi="Calibri"/>
+          <w:sz w:val="22"/>
+        </w:rPr>
+        <w:t xml:space="preserve"> en </w:t>
+      </w:r>
+      <w:r>
+        <w:rPr>
+          <w:rFonts w:ascii="Consolas" w:hAnsi="Consolas"/>
+          <w:color w:val="0B2545"/>
+          <w:sz w:val="19"/>
+          <w:shd w:fill="E8EEF5"/>
+        </w:rPr>
+        <w:t>Configuración</w:t>
+      </w:r>
+      <w:r>
+        <w:rPr>
+          <w:rFonts w:ascii="Calibri" w:hAnsi="Calibri"/>
+          <w:sz w:val="22"/>
+        </w:rPr>
+        <w:t xml:space="preserve"> y editar los campos de ese año. Las horas por día, las fechas de intensiva y las reglas horarias quedan separadas por año. La </w:t>
+      </w:r>
+      <w:r>
+        <w:rPr>
+          <w:rFonts w:ascii="Consolas" w:hAnsi="Consolas"/>
+          <w:color w:val="0B2545"/>
+          <w:sz w:val="19"/>
+          <w:shd w:fill="E8EEF5"/>
+        </w:rPr>
+        <w:t>Bolsa inicial del histórico</w:t>
+      </w:r>
+      <w:r>
+        <w:rPr>
+          <w:rFonts w:ascii="Calibri" w:hAnsi="Calibri"/>
+          <w:sz w:val="22"/>
+        </w:rPr>
+        <w:t xml:space="preserve"> sigue siendo global y no debe utilizarse para abrir un año nuevo.</w:t>
+      </w:r>
+    </w:p>
+    <w:p>
+      <w:r>
+        <w:rPr>
+          <w:rFonts w:ascii="Calibri" w:hAnsi="Calibri"/>
+          <w:sz w:val="22"/>
+        </w:rPr>
+        <w:t>Si los ajustes quedan guardados localmente pero la sincronización indica que falta activar la jornada anual, exportar un JSON y solicitar al responsable de la aplicación que habilite el almacenamiento anual. Reintentar la sincronización después de corregirlo.</w:t>
       </w:r>
     </w:p>
     <w:p>
@@ -8085,6 +8313,12 @@
     </w:lvlOverride>
   </w:num>
   <w:num w:numId="28">
+    <w:abstractNumId w:val="10"/>
+    <w:lvlOverride w:ilvl="0">
+      <w:startOverride w:val="1"/>
+    </w:lvlOverride>
+  </w:num>
+  <w:num w:numId="29">
     <w:abstractNumId w:val="10"/>
     <w:lvlOverride w:ilvl="0">
       <w:startOverride w:val="1"/>

</xml_diff>